<commit_message>
chore(marca): actualiza nombre oficial
Unifica el nombre del condominio en la landing, metadatos SEO, vistas administrativas y manual de usuario; actualiza también la prueba de SEO.
</commit_message>
<xml_diff>
--- a/docs/manual de usuario final.docx
+++ b/docs/manual de usuario final.docx
@@ -90,7 +90,7 @@
           <w:color w:val="000000"/>
           <w:sz w:val="28"/>
         </w:rPr>
-        <w:t>Sistema de Cobranzas y Gestión de Pagos — Conjunto Residencial "Las Mesetas de Morón" (Condominio Digital)</w:t>
+        <w:t>Sistema de Cobranzas y Gestión de Pagos — Condominio Conjunto "Las Mesetas de Morón" (Condominio Digital)</w:t>
       </w:r>
     </w:p>
     <w:p>
@@ -109,7 +109,7 @@
           <w:color w:val="000000"/>
           <w:sz w:val="24"/>
         </w:rPr>
-        <w:t>Conjunto Residencial "Las Mesetas de Morón" — Condominio Digital</w:t>
+        <w:t>Condominio Conjunto "Las Mesetas de Morón" — Condominio Digital</w:t>
       </w:r>
     </w:p>
     <w:p>
@@ -1005,7 +1005,7 @@
           <w:rFonts w:ascii="Calibri" w:hAnsi="Calibri" w:cs="Calibri"/>
           <w:color w:val="000000"/>
         </w:rPr>
-        <w:t>Condominio Digital es el sistema web de cobranzas y gestión de pagos del Conjunto Residencial "Las Mesetas de Morón". La administración registra y verifica los pagos, los concilia con el extracto bancario, controla los gastos con sus facturas, emite la deuda mensual, publica comunicados y conserva la auditoría de las acciones importantes. El portal público permite reportar un pago sin iniciar sesión.</w:t>
+        <w:t>Condominio Digital es el sistema web de cobranzas y gestión de pagos del Condominio Conjunto "Las Mesetas de Morón". La administración registra y verifica los pagos, los concilia con el extracto bancario, controla los gastos con sus facturas, emite la deuda mensual, publica comunicados y conserva la auditoría de las acciones importantes. El portal público permite reportar un pago sin iniciar sesión.</w:t>
       </w:r>
     </w:p>
     <w:p>

</xml_diff>